<commit_message>
Ghi lần chạy Stata của bài tiếng Việt (21/10, 21:41) và lưu kết quả
phan_tich_bai_tieng_viet.do chạy không lỗi: 62/62 dòng kết quả khớp bản
Python đến 10⁻¹³, mọi bảng mô tả khớp từng ô. Bản Python làm tròn nửa lên
như Stata; bài sửa 31,2% thành 31,3% (55/176). Kết quả tổng hợp lưu ở
output/tables/stata_vi/.

Co-Authored-By: Claude Opus 5.5 <noreply@anthropic.com>
Claude-Session: https://claude.ai/code/session_012tLfSWXFiJ8KJH7nwqmjYj
</commit_message>
<xml_diff>
--- a/docs/bai_tieng_viet/Bai_bao.docx
+++ b/docs/bai_tieng_viet/Bai_bao.docx
@@ -5596,7 +5596,7 @@
         <w:rPr>
           <w:rFonts w:ascii="Times New Roman" w:hAnsi="Times New Roman" w:cs="Times New Roman" w:eastAsia="Times New Roman"/>
         </w:rPr>
-        <w:t xml:space="preserve">Bảng 5 cho thấy chính sách DEI hiếm gặp. Kênh khiếu nại bảo mật là chính sách được báo cáo nhiều nhất (31,2%). Các chính sách dành riêng cho người LGBT rất ít: 8,5% cho biết có chính sách bằng văn bản chống phân biệt đối xử dựa trên xu hướng tính dục và bản dạng giới, 10,2% có đào tạo về DEI, 6,8% có biện pháp hỗ trợ người chuyển giới, và dưới 10 người có phúc lợi cho bạn đời cùng giới. Hơn một nửa (52,3%) không nêu chính sách nào là có. Mức</w:t>
+        <w:t xml:space="preserve">Bảng 5 cho thấy chính sách DEI hiếm gặp. Kênh khiếu nại bảo mật là chính sách được báo cáo nhiều nhất (31,3%). Các chính sách dành riêng cho người LGBT rất ít: 8,5% cho biết có chính sách bằng văn bản chống phân biệt đối xử dựa trên xu hướng tính dục và bản dạng giới, 10,2% có đào tạo về DEI, 6,8% có biện pháp hỗ trợ người chuyển giới, và dưới 10 người có phúc lợi cho bạn đời cùng giới. Hơn một nửa (52,3%) không nêu chính sách nào là có. Mức</w:t>
       </w:r>
       <w:r>
         <w:rPr>
@@ -5881,7 +5881,7 @@
                 <w:rFonts w:ascii="Times New Roman" w:hAnsi="Times New Roman"/>
                 <w:sz w:val="22"/>
               </w:rPr>
-              <w:t xml:space="preserve">55 (31,2)</w:t>
+              <w:t xml:space="preserve">55 (31,3)</w:t>
             </w:r>
           </w:p>
         </w:tc>

</xml_diff>